<commit_message>
Version actualizada documentación de Autoevaluació
</commit_message>
<xml_diff>
--- a/Fase 2/Evidencias Individuales/Gatica_Brayan_2.2_APT122_AutoevaluacionAvance Fase2.docx
+++ b/Fase 2/Evidencias Individuales/Gatica_Brayan_2.2_APT122_AutoevaluacionAvance Fase2.docx
@@ -6,9 +6,7 @@
       <w:pPr>
         <w:pStyle w:val="Title"/>
         <w:spacing w:line="360" w:lineRule="auto"/>
-        <w:rPr>
-          <w:rFonts w:ascii="Calibri" w:cs="Calibri" w:eastAsia="Calibri" w:hAnsi="Calibri"/>
-        </w:rPr>
+        <w:rPr/>
       </w:pPr>
       <w:bookmarkStart w:colFirst="0" w:colLast="0" w:name="_m3n8knhpvpa9" w:id="0"/>
       <w:bookmarkEnd w:id="0"/>
@@ -23,9 +21,7 @@
         <w:pStyle w:val="Title"/>
         <w:spacing w:line="360" w:lineRule="auto"/>
         <w:jc w:val="center"/>
-        <w:rPr>
-          <w:rFonts w:ascii="Calibri" w:cs="Calibri" w:eastAsia="Calibri" w:hAnsi="Calibri"/>
-        </w:rPr>
+        <w:rPr/>
       </w:pPr>
       <w:bookmarkStart w:colFirst="0" w:colLast="0" w:name="_4ck3y1ftks9p" w:id="1"/>
       <w:bookmarkEnd w:id="1"/>
@@ -41,7 +37,6 @@
         <w:spacing w:line="360" w:lineRule="auto"/>
         <w:jc w:val="center"/>
         <w:rPr>
-          <w:rFonts w:ascii="Calibri" w:cs="Calibri" w:eastAsia="Calibri" w:hAnsi="Calibri"/>
           <w:b w:val="1"/>
           <w:sz w:val="70"/>
           <w:szCs w:val="70"/>
@@ -51,7 +46,6 @@
       <w:bookmarkEnd w:id="2"/>
       <w:r>
         <w:rPr>
-          <w:rFonts w:ascii="Calibri" w:cs="Calibri" w:eastAsia="Calibri" w:hAnsi="Calibri"/>
           <w:b w:val="1"/>
           <w:sz w:val="70"/>
           <w:szCs w:val="70"/>
@@ -64,127 +58,118 @@
       <w:pPr>
         <w:spacing w:line="360" w:lineRule="auto"/>
         <w:rPr>
-          <w:rFonts w:ascii="Calibri" w:cs="Calibri" w:eastAsia="Calibri" w:hAnsi="Calibri"/>
-          <w:sz w:val="24"/>
-          <w:szCs w:val="24"/>
-        </w:rPr>
-      </w:pPr>
-      <w:r>
-        <w:rPr>
-          <w:rtl w:val="0"/>
-        </w:rPr>
-      </w:r>
-    </w:p>
-    <w:p>
-      <w:pPr>
-        <w:spacing w:line="360" w:lineRule="auto"/>
-        <w:rPr>
-          <w:rFonts w:ascii="Calibri" w:cs="Calibri" w:eastAsia="Calibri" w:hAnsi="Calibri"/>
-          <w:sz w:val="24"/>
-          <w:szCs w:val="24"/>
-        </w:rPr>
-      </w:pPr>
-      <w:r>
-        <w:rPr>
-          <w:rtl w:val="0"/>
-        </w:rPr>
-      </w:r>
-    </w:p>
-    <w:p>
-      <w:pPr>
-        <w:spacing w:line="360" w:lineRule="auto"/>
-        <w:rPr>
-          <w:rFonts w:ascii="Calibri" w:cs="Calibri" w:eastAsia="Calibri" w:hAnsi="Calibri"/>
-          <w:sz w:val="24"/>
-          <w:szCs w:val="24"/>
-        </w:rPr>
-      </w:pPr>
-      <w:r>
-        <w:rPr>
-          <w:rtl w:val="0"/>
-        </w:rPr>
-      </w:r>
-    </w:p>
-    <w:p>
-      <w:pPr>
-        <w:spacing w:line="360" w:lineRule="auto"/>
-        <w:rPr>
-          <w:rFonts w:ascii="Calibri" w:cs="Calibri" w:eastAsia="Calibri" w:hAnsi="Calibri"/>
-          <w:sz w:val="24"/>
-          <w:szCs w:val="24"/>
-        </w:rPr>
-      </w:pPr>
-      <w:r>
-        <w:rPr>
-          <w:rtl w:val="0"/>
-        </w:rPr>
-      </w:r>
-    </w:p>
-    <w:p>
-      <w:pPr>
-        <w:spacing w:line="360" w:lineRule="auto"/>
-        <w:rPr>
-          <w:rFonts w:ascii="Calibri" w:cs="Calibri" w:eastAsia="Calibri" w:hAnsi="Calibri"/>
-          <w:sz w:val="24"/>
-          <w:szCs w:val="24"/>
-        </w:rPr>
-      </w:pPr>
-      <w:r>
-        <w:rPr>
-          <w:rtl w:val="0"/>
-        </w:rPr>
-      </w:r>
-    </w:p>
-    <w:p>
-      <w:pPr>
-        <w:spacing w:line="360" w:lineRule="auto"/>
-        <w:rPr>
-          <w:rFonts w:ascii="Calibri" w:cs="Calibri" w:eastAsia="Calibri" w:hAnsi="Calibri"/>
-          <w:sz w:val="24"/>
-          <w:szCs w:val="24"/>
-        </w:rPr>
-      </w:pPr>
-      <w:r>
-        <w:rPr>
-          <w:rtl w:val="0"/>
-        </w:rPr>
-      </w:r>
-    </w:p>
-    <w:p>
-      <w:pPr>
-        <w:spacing w:line="360" w:lineRule="auto"/>
-        <w:rPr>
-          <w:rFonts w:ascii="Calibri" w:cs="Calibri" w:eastAsia="Calibri" w:hAnsi="Calibri"/>
-          <w:sz w:val="24"/>
-          <w:szCs w:val="24"/>
-        </w:rPr>
-      </w:pPr>
-      <w:r>
-        <w:rPr>
-          <w:rtl w:val="0"/>
-        </w:rPr>
-      </w:r>
-    </w:p>
-    <w:p>
-      <w:pPr>
-        <w:spacing w:line="360" w:lineRule="auto"/>
-        <w:rPr>
-          <w:rFonts w:ascii="Calibri" w:cs="Calibri" w:eastAsia="Calibri" w:hAnsi="Calibri"/>
-          <w:sz w:val="24"/>
-          <w:szCs w:val="24"/>
-        </w:rPr>
-      </w:pPr>
-      <w:r>
-        <w:rPr>
-          <w:rtl w:val="0"/>
-        </w:rPr>
-      </w:r>
-    </w:p>
-    <w:p>
-      <w:pPr>
-        <w:spacing w:line="360" w:lineRule="auto"/>
-        <w:rPr>
-          <w:rFonts w:ascii="Calibri" w:cs="Calibri" w:eastAsia="Calibri" w:hAnsi="Calibri"/>
+          <w:sz w:val="24"/>
+          <w:szCs w:val="24"/>
+        </w:rPr>
+      </w:pPr>
+      <w:r>
+        <w:rPr>
+          <w:rtl w:val="0"/>
+        </w:rPr>
+      </w:r>
+    </w:p>
+    <w:p>
+      <w:pPr>
+        <w:spacing w:line="360" w:lineRule="auto"/>
+        <w:rPr>
+          <w:sz w:val="24"/>
+          <w:szCs w:val="24"/>
+        </w:rPr>
+      </w:pPr>
+      <w:r>
+        <w:rPr>
+          <w:rtl w:val="0"/>
+        </w:rPr>
+      </w:r>
+    </w:p>
+    <w:p>
+      <w:pPr>
+        <w:spacing w:line="360" w:lineRule="auto"/>
+        <w:rPr>
+          <w:sz w:val="24"/>
+          <w:szCs w:val="24"/>
+        </w:rPr>
+      </w:pPr>
+      <w:r>
+        <w:rPr>
+          <w:rtl w:val="0"/>
+        </w:rPr>
+      </w:r>
+    </w:p>
+    <w:p>
+      <w:pPr>
+        <w:spacing w:line="360" w:lineRule="auto"/>
+        <w:rPr>
+          <w:sz w:val="24"/>
+          <w:szCs w:val="24"/>
+        </w:rPr>
+      </w:pPr>
+      <w:r>
+        <w:rPr>
+          <w:rtl w:val="0"/>
+        </w:rPr>
+      </w:r>
+    </w:p>
+    <w:p>
+      <w:pPr>
+        <w:spacing w:line="360" w:lineRule="auto"/>
+        <w:rPr>
+          <w:sz w:val="24"/>
+          <w:szCs w:val="24"/>
+        </w:rPr>
+      </w:pPr>
+      <w:r>
+        <w:rPr>
+          <w:rtl w:val="0"/>
+        </w:rPr>
+      </w:r>
+    </w:p>
+    <w:p>
+      <w:pPr>
+        <w:spacing w:line="360" w:lineRule="auto"/>
+        <w:rPr>
+          <w:sz w:val="24"/>
+          <w:szCs w:val="24"/>
+        </w:rPr>
+      </w:pPr>
+      <w:r>
+        <w:rPr>
+          <w:rtl w:val="0"/>
+        </w:rPr>
+      </w:r>
+    </w:p>
+    <w:p>
+      <w:pPr>
+        <w:spacing w:line="360" w:lineRule="auto"/>
+        <w:rPr>
+          <w:sz w:val="24"/>
+          <w:szCs w:val="24"/>
+        </w:rPr>
+      </w:pPr>
+      <w:r>
+        <w:rPr>
+          <w:rtl w:val="0"/>
+        </w:rPr>
+      </w:r>
+    </w:p>
+    <w:p>
+      <w:pPr>
+        <w:spacing w:line="360" w:lineRule="auto"/>
+        <w:rPr>
+          <w:sz w:val="24"/>
+          <w:szCs w:val="24"/>
+        </w:rPr>
+      </w:pPr>
+      <w:r>
+        <w:rPr>
+          <w:rtl w:val="0"/>
+        </w:rPr>
+      </w:r>
+    </w:p>
+    <w:p>
+      <w:pPr>
+        <w:spacing w:line="360" w:lineRule="auto"/>
+        <w:rPr>
           <w:sz w:val="24"/>
           <w:szCs w:val="24"/>
         </w:rPr>
@@ -200,7 +185,6 @@
         <w:spacing w:line="360" w:lineRule="auto"/>
         <w:jc w:val="right"/>
         <w:rPr>
-          <w:rFonts w:ascii="Calibri" w:cs="Calibri" w:eastAsia="Calibri" w:hAnsi="Calibri"/>
           <w:b w:val="1"/>
           <w:sz w:val="24"/>
           <w:szCs w:val="24"/>
@@ -217,7 +201,6 @@
         <w:spacing w:line="360" w:lineRule="auto"/>
         <w:jc w:val="right"/>
         <w:rPr>
-          <w:rFonts w:ascii="Calibri" w:cs="Calibri" w:eastAsia="Calibri" w:hAnsi="Calibri"/>
           <w:b w:val="1"/>
           <w:sz w:val="24"/>
           <w:szCs w:val="24"/>
@@ -234,7 +217,6 @@
         <w:spacing w:line="360" w:lineRule="auto"/>
         <w:jc w:val="right"/>
         <w:rPr>
-          <w:rFonts w:ascii="Calibri" w:cs="Calibri" w:eastAsia="Calibri" w:hAnsi="Calibri"/>
           <w:b w:val="1"/>
           <w:sz w:val="24"/>
           <w:szCs w:val="24"/>
@@ -251,7 +233,6 @@
         <w:spacing w:line="360" w:lineRule="auto"/>
         <w:jc w:val="right"/>
         <w:rPr>
-          <w:rFonts w:ascii="Calibri" w:cs="Calibri" w:eastAsia="Calibri" w:hAnsi="Calibri"/>
           <w:b w:val="1"/>
           <w:sz w:val="24"/>
           <w:szCs w:val="24"/>
@@ -268,7 +249,6 @@
         <w:spacing w:line="360" w:lineRule="auto"/>
         <w:jc w:val="right"/>
         <w:rPr>
-          <w:rFonts w:ascii="Calibri" w:cs="Calibri" w:eastAsia="Calibri" w:hAnsi="Calibri"/>
           <w:b w:val="1"/>
           <w:sz w:val="24"/>
           <w:szCs w:val="24"/>
@@ -285,7 +265,6 @@
         <w:spacing w:line="360" w:lineRule="auto"/>
         <w:jc w:val="right"/>
         <w:rPr>
-          <w:rFonts w:ascii="Calibri" w:cs="Calibri" w:eastAsia="Calibri" w:hAnsi="Calibri"/>
           <w:b w:val="1"/>
           <w:sz w:val="24"/>
           <w:szCs w:val="24"/>
@@ -302,15 +281,13 @@
         <w:spacing w:line="360" w:lineRule="auto"/>
         <w:jc w:val="right"/>
         <w:rPr>
-          <w:rFonts w:ascii="Calibri" w:cs="Calibri" w:eastAsia="Calibri" w:hAnsi="Calibri"/>
-          <w:b w:val="1"/>
-          <w:sz w:val="24"/>
-          <w:szCs w:val="24"/>
-        </w:rPr>
-      </w:pPr>
-      <w:r>
-        <w:rPr>
-          <w:rFonts w:ascii="Calibri" w:cs="Calibri" w:eastAsia="Calibri" w:hAnsi="Calibri"/>
+          <w:b w:val="1"/>
+          <w:sz w:val="24"/>
+          <w:szCs w:val="24"/>
+        </w:rPr>
+      </w:pPr>
+      <w:r>
+        <w:rPr>
           <w:b w:val="1"/>
           <w:sz w:val="24"/>
           <w:szCs w:val="24"/>
@@ -324,14 +301,12 @@
         <w:spacing w:line="360" w:lineRule="auto"/>
         <w:jc w:val="right"/>
         <w:rPr>
-          <w:rFonts w:ascii="Calibri" w:cs="Calibri" w:eastAsia="Calibri" w:hAnsi="Calibri"/>
-          <w:sz w:val="24"/>
-          <w:szCs w:val="24"/>
-        </w:rPr>
-      </w:pPr>
-      <w:r>
-        <w:rPr>
-          <w:rFonts w:ascii="Calibri" w:cs="Calibri" w:eastAsia="Calibri" w:hAnsi="Calibri"/>
+          <w:sz w:val="24"/>
+          <w:szCs w:val="24"/>
+        </w:rPr>
+      </w:pPr>
+      <w:r>
+        <w:rPr>
           <w:sz w:val="24"/>
           <w:szCs w:val="24"/>
           <w:rtl w:val="0"/>
@@ -344,15 +319,13 @@
         <w:spacing w:line="360" w:lineRule="auto"/>
         <w:jc w:val="right"/>
         <w:rPr>
-          <w:rFonts w:ascii="Calibri" w:cs="Calibri" w:eastAsia="Calibri" w:hAnsi="Calibri"/>
-          <w:b w:val="1"/>
-          <w:sz w:val="24"/>
-          <w:szCs w:val="24"/>
-        </w:rPr>
-      </w:pPr>
-      <w:r>
-        <w:rPr>
-          <w:rFonts w:ascii="Calibri" w:cs="Calibri" w:eastAsia="Calibri" w:hAnsi="Calibri"/>
+          <w:b w:val="1"/>
+          <w:sz w:val="24"/>
+          <w:szCs w:val="24"/>
+        </w:rPr>
+      </w:pPr>
+      <w:r>
+        <w:rPr>
           <w:b w:val="1"/>
           <w:sz w:val="24"/>
           <w:szCs w:val="24"/>
@@ -366,14 +339,12 @@
         <w:spacing w:line="360" w:lineRule="auto"/>
         <w:jc w:val="right"/>
         <w:rPr>
-          <w:rFonts w:ascii="Calibri" w:cs="Calibri" w:eastAsia="Calibri" w:hAnsi="Calibri"/>
-          <w:sz w:val="24"/>
-          <w:szCs w:val="24"/>
-        </w:rPr>
-      </w:pPr>
-      <w:r>
-        <w:rPr>
-          <w:rFonts w:ascii="Calibri" w:cs="Calibri" w:eastAsia="Calibri" w:hAnsi="Calibri"/>
+          <w:sz w:val="24"/>
+          <w:szCs w:val="24"/>
+        </w:rPr>
+      </w:pPr>
+      <w:r>
+        <w:rPr>
           <w:sz w:val="24"/>
           <w:szCs w:val="24"/>
           <w:rtl w:val="0"/>
@@ -386,15 +357,13 @@
         <w:spacing w:line="360" w:lineRule="auto"/>
         <w:jc w:val="right"/>
         <w:rPr>
-          <w:rFonts w:ascii="Calibri" w:cs="Calibri" w:eastAsia="Calibri" w:hAnsi="Calibri"/>
-          <w:b w:val="1"/>
-          <w:sz w:val="24"/>
-          <w:szCs w:val="24"/>
-        </w:rPr>
-      </w:pPr>
-      <w:r>
-        <w:rPr>
-          <w:rFonts w:ascii="Calibri" w:cs="Calibri" w:eastAsia="Calibri" w:hAnsi="Calibri"/>
+          <w:b w:val="1"/>
+          <w:sz w:val="24"/>
+          <w:szCs w:val="24"/>
+        </w:rPr>
+      </w:pPr>
+      <w:r>
+        <w:rPr>
           <w:b w:val="1"/>
           <w:sz w:val="24"/>
           <w:szCs w:val="24"/>
@@ -408,14 +377,12 @@
         <w:spacing w:line="360" w:lineRule="auto"/>
         <w:jc w:val="right"/>
         <w:rPr>
-          <w:rFonts w:ascii="Calibri" w:cs="Calibri" w:eastAsia="Calibri" w:hAnsi="Calibri"/>
-          <w:sz w:val="24"/>
-          <w:szCs w:val="24"/>
-        </w:rPr>
-      </w:pPr>
-      <w:r>
-        <w:rPr>
-          <w:rFonts w:ascii="Calibri" w:cs="Calibri" w:eastAsia="Calibri" w:hAnsi="Calibri"/>
+          <w:sz w:val="24"/>
+          <w:szCs w:val="24"/>
+        </w:rPr>
+      </w:pPr>
+      <w:r>
+        <w:rPr>
           <w:sz w:val="24"/>
           <w:szCs w:val="24"/>
           <w:rtl w:val="0"/>
@@ -428,14 +395,12 @@
         <w:spacing w:line="360" w:lineRule="auto"/>
         <w:jc w:val="right"/>
         <w:rPr>
-          <w:rFonts w:ascii="Calibri" w:cs="Calibri" w:eastAsia="Calibri" w:hAnsi="Calibri"/>
-          <w:sz w:val="24"/>
-          <w:szCs w:val="24"/>
-        </w:rPr>
-      </w:pPr>
-      <w:r>
-        <w:rPr>
-          <w:rFonts w:ascii="Calibri" w:cs="Calibri" w:eastAsia="Calibri" w:hAnsi="Calibri"/>
+          <w:sz w:val="24"/>
+          <w:szCs w:val="24"/>
+        </w:rPr>
+      </w:pPr>
+      <w:r>
+        <w:rPr>
           <w:sz w:val="24"/>
           <w:szCs w:val="24"/>
           <w:rtl w:val="0"/>
@@ -448,15 +413,13 @@
         <w:spacing w:line="360" w:lineRule="auto"/>
         <w:jc w:val="right"/>
         <w:rPr>
-          <w:rFonts w:ascii="Calibri" w:cs="Calibri" w:eastAsia="Calibri" w:hAnsi="Calibri"/>
-          <w:b w:val="1"/>
-          <w:sz w:val="24"/>
-          <w:szCs w:val="24"/>
-        </w:rPr>
-      </w:pPr>
-      <w:r>
-        <w:rPr>
-          <w:rFonts w:ascii="Calibri" w:cs="Calibri" w:eastAsia="Calibri" w:hAnsi="Calibri"/>
+          <w:b w:val="1"/>
+          <w:sz w:val="24"/>
+          <w:szCs w:val="24"/>
+        </w:rPr>
+      </w:pPr>
+      <w:r>
+        <w:rPr>
           <w:b w:val="1"/>
           <w:sz w:val="24"/>
           <w:szCs w:val="24"/>
@@ -470,14 +433,12 @@
         <w:spacing w:line="360" w:lineRule="auto"/>
         <w:jc w:val="right"/>
         <w:rPr>
-          <w:rFonts w:ascii="Calibri" w:cs="Calibri" w:eastAsia="Calibri" w:hAnsi="Calibri"/>
-          <w:sz w:val="24"/>
-          <w:szCs w:val="24"/>
-        </w:rPr>
-      </w:pPr>
-      <w:r>
-        <w:rPr>
-          <w:rFonts w:ascii="Calibri" w:cs="Calibri" w:eastAsia="Calibri" w:hAnsi="Calibri"/>
+          <w:sz w:val="24"/>
+          <w:szCs w:val="24"/>
+        </w:rPr>
+      </w:pPr>
+      <w:r>
+        <w:rPr>
           <w:sz w:val="24"/>
           <w:szCs w:val="24"/>
           <w:rtl w:val="0"/>
@@ -488,9 +449,23 @@
     <w:p>
       <w:pPr>
         <w:spacing w:line="360" w:lineRule="auto"/>
+        <w:jc w:val="right"/>
+        <w:rPr>
+          <w:sz w:val="24"/>
+          <w:szCs w:val="24"/>
+        </w:rPr>
+      </w:pPr>
+      <w:r>
+        <w:rPr>
+          <w:rtl w:val="0"/>
+        </w:rPr>
+      </w:r>
+    </w:p>
+    <w:p>
+      <w:pPr>
+        <w:spacing w:line="360" w:lineRule="auto"/>
         <w:jc w:val="left"/>
         <w:rPr>
-          <w:rFonts w:ascii="Calibri" w:cs="Calibri" w:eastAsia="Calibri" w:hAnsi="Calibri"/>
           <w:sz w:val="24"/>
           <w:szCs w:val="24"/>
         </w:rPr>
@@ -503,7 +478,7 @@
     </w:p>
     <w:sdt>
       <w:sdtPr>
-        <w:id w:val="-1339982826"/>
+        <w:id w:val="310952114"/>
         <w:docPartObj>
           <w:docPartGallery w:val="Table of Contents"/>
           <w:docPartUnique w:val="1"/>
@@ -749,7 +724,7 @@
               </w:rPr>
               <w:t xml:space="preserve">2.3 Retroalimentación recibida</w:t>
               <w:tab/>
-              <w:t xml:space="preserve">3</w:t>
+              <w:t xml:space="preserve">4</w:t>
             </w:r>
           </w:hyperlink>
           <w:r>
@@ -846,7 +821,7 @@
               </w:rPr>
               <w:t xml:space="preserve">3. Metodología de trabajo</w:t>
               <w:tab/>
-              <w:t xml:space="preserve">4</w:t>
+              <w:t xml:space="preserve">5</w:t>
             </w:r>
           </w:hyperlink>
           <w:r>
@@ -895,7 +870,7 @@
               </w:rPr>
               <w:t xml:space="preserve">3.1 Metodología aplicada</w:t>
               <w:tab/>
-              <w:t xml:space="preserve">4</w:t>
+              <w:t xml:space="preserve">5</w:t>
             </w:r>
           </w:hyperlink>
           <w:r>
@@ -944,7 +919,7 @@
               </w:rPr>
               <w:t xml:space="preserve">3.2 Herramientas utilizadas</w:t>
               <w:tab/>
-              <w:t xml:space="preserve">4</w:t>
+              <w:t xml:space="preserve">5</w:t>
             </w:r>
           </w:hyperlink>
           <w:r>
@@ -993,7 +968,7 @@
               </w:rPr>
               <w:t xml:space="preserve">3.3 Distribución de roles y tareas</w:t>
               <w:tab/>
-              <w:t xml:space="preserve">4</w:t>
+              <w:t xml:space="preserve">5</w:t>
             </w:r>
           </w:hyperlink>
           <w:r>
@@ -1041,7 +1016,7 @@
               </w:rPr>
               <w:t xml:space="preserve">Pertinencia con los requerimientos disciplinares</w:t>
               <w:tab/>
-              <w:t xml:space="preserve">5</w:t>
+              <w:t xml:space="preserve">6</w:t>
             </w:r>
           </w:hyperlink>
           <w:r>
@@ -1089,7 +1064,7 @@
               </w:rPr>
               <w:t xml:space="preserve">4. Desarrollo de ingeniería</w:t>
               <w:tab/>
-              <w:t xml:space="preserve">5</w:t>
+              <w:t xml:space="preserve">6</w:t>
             </w:r>
           </w:hyperlink>
           <w:r>
@@ -1138,7 +1113,7 @@
               </w:rPr>
               <w:t xml:space="preserve">4.1 Arquitectura del sistema</w:t>
               <w:tab/>
-              <w:t xml:space="preserve">5</w:t>
+              <w:t xml:space="preserve">6</w:t>
             </w:r>
           </w:hyperlink>
           <w:r>
@@ -1187,7 +1162,7 @@
               </w:rPr>
               <w:t xml:space="preserve">4.2 Backend en Supabase Cloud Functions</w:t>
               <w:tab/>
-              <w:t xml:space="preserve">5</w:t>
+              <w:t xml:space="preserve">6</w:t>
             </w:r>
           </w:hyperlink>
           <w:r>
@@ -1236,7 +1211,7 @@
               </w:rPr>
               <w:t xml:space="preserve">4.3 Base de datos y autenticación</w:t>
               <w:tab/>
-              <w:t xml:space="preserve">5</w:t>
+              <w:t xml:space="preserve">7</w:t>
             </w:r>
           </w:hyperlink>
           <w:r>
@@ -1285,7 +1260,7 @@
               </w:rPr>
               <w:t xml:space="preserve">4.4 Frontend y experiencia de usuario</w:t>
               <w:tab/>
-              <w:t xml:space="preserve">5</w:t>
+              <w:t xml:space="preserve">7</w:t>
             </w:r>
           </w:hyperlink>
           <w:r>
@@ -1334,7 +1309,7 @@
               </w:rPr>
               <w:t xml:space="preserve">4.5 Historias de usuario completadas y pendientes</w:t>
               <w:tab/>
-              <w:t xml:space="preserve">6</w:t>
+              <w:t xml:space="preserve">7</w:t>
             </w:r>
           </w:hyperlink>
           <w:r>
@@ -1383,7 +1358,7 @@
               </w:rPr>
               <w:t xml:space="preserve">4.6 Evidencias de avance</w:t>
               <w:tab/>
-              <w:t xml:space="preserve">6</w:t>
+              <w:t xml:space="preserve">7</w:t>
             </w:r>
           </w:hyperlink>
           <w:r>
@@ -1431,7 +1406,7 @@
               </w:rPr>
               <w:t xml:space="preserve">5. Conclusiones</w:t>
               <w:tab/>
-              <w:t xml:space="preserve">6</w:t>
+              <w:t xml:space="preserve">8</w:t>
             </w:r>
           </w:hyperlink>
           <w:r>
@@ -1479,7 +1454,7 @@
               </w:rPr>
               <w:t xml:space="preserve">6. Reflexiones individuales</w:t>
               <w:tab/>
-              <w:t xml:space="preserve">7</w:t>
+              <w:t xml:space="preserve">8</w:t>
             </w:r>
           </w:hyperlink>
           <w:r>
@@ -1498,7 +1473,6 @@
         <w:spacing w:line="360" w:lineRule="auto"/>
         <w:jc w:val="left"/>
         <w:rPr>
-          <w:rFonts w:ascii="Calibri" w:cs="Calibri" w:eastAsia="Calibri" w:hAnsi="Calibri"/>
           <w:sz w:val="24"/>
           <w:szCs w:val="24"/>
         </w:rPr>
@@ -1514,7 +1488,6 @@
         <w:spacing w:line="360" w:lineRule="auto"/>
         <w:jc w:val="left"/>
         <w:rPr>
-          <w:rFonts w:ascii="Calibri" w:cs="Calibri" w:eastAsia="Calibri" w:hAnsi="Calibri"/>
           <w:sz w:val="24"/>
           <w:szCs w:val="24"/>
         </w:rPr>
@@ -1530,7 +1503,6 @@
         <w:spacing w:line="360" w:lineRule="auto"/>
         <w:jc w:val="left"/>
         <w:rPr>
-          <w:rFonts w:ascii="Calibri" w:cs="Calibri" w:eastAsia="Calibri" w:hAnsi="Calibri"/>
           <w:sz w:val="24"/>
           <w:szCs w:val="24"/>
         </w:rPr>
@@ -1546,7 +1518,6 @@
         <w:spacing w:line="360" w:lineRule="auto"/>
         <w:jc w:val="left"/>
         <w:rPr>
-          <w:rFonts w:ascii="Calibri" w:cs="Calibri" w:eastAsia="Calibri" w:hAnsi="Calibri"/>
           <w:sz w:val="24"/>
           <w:szCs w:val="24"/>
         </w:rPr>
@@ -1562,7 +1533,6 @@
         <w:spacing w:line="360" w:lineRule="auto"/>
         <w:jc w:val="left"/>
         <w:rPr>
-          <w:rFonts w:ascii="Calibri" w:cs="Calibri" w:eastAsia="Calibri" w:hAnsi="Calibri"/>
           <w:sz w:val="24"/>
           <w:szCs w:val="24"/>
         </w:rPr>
@@ -1578,7 +1548,6 @@
         <w:spacing w:line="360" w:lineRule="auto"/>
         <w:jc w:val="left"/>
         <w:rPr>
-          <w:rFonts w:ascii="Calibri" w:cs="Calibri" w:eastAsia="Calibri" w:hAnsi="Calibri"/>
           <w:sz w:val="24"/>
           <w:szCs w:val="24"/>
         </w:rPr>
@@ -1594,7 +1563,6 @@
         <w:spacing w:line="360" w:lineRule="auto"/>
         <w:jc w:val="left"/>
         <w:rPr>
-          <w:rFonts w:ascii="Calibri" w:cs="Calibri" w:eastAsia="Calibri" w:hAnsi="Calibri"/>
           <w:sz w:val="24"/>
           <w:szCs w:val="24"/>
         </w:rPr>
@@ -1610,116 +1578,149 @@
         <w:spacing w:line="360" w:lineRule="auto"/>
         <w:jc w:val="left"/>
         <w:rPr>
-          <w:rFonts w:ascii="Calibri" w:cs="Calibri" w:eastAsia="Calibri" w:hAnsi="Calibri"/>
-          <w:sz w:val="24"/>
-          <w:szCs w:val="24"/>
-        </w:rPr>
-      </w:pPr>
-      <w:r>
-        <w:rPr>
-          <w:rtl w:val="0"/>
-        </w:rPr>
-      </w:r>
-    </w:p>
-    <w:p>
-      <w:pPr>
-        <w:spacing w:line="360" w:lineRule="auto"/>
-        <w:jc w:val="right"/>
-        <w:rPr>
-          <w:rFonts w:ascii="Calibri" w:cs="Calibri" w:eastAsia="Calibri" w:hAnsi="Calibri"/>
-          <w:sz w:val="24"/>
-          <w:szCs w:val="24"/>
-        </w:rPr>
-      </w:pPr>
-      <w:r>
-        <w:rPr>
-          <w:rtl w:val="0"/>
-        </w:rPr>
-      </w:r>
-    </w:p>
-    <w:p>
-      <w:pPr>
-        <w:pStyle w:val="Heading2"/>
-        <w:keepNext w:val="0"/>
-        <w:keepLines w:val="0"/>
-        <w:spacing w:after="80" w:lineRule="auto"/>
-        <w:rPr>
-          <w:b w:val="1"/>
-          <w:sz w:val="34"/>
-          <w:szCs w:val="34"/>
-        </w:rPr>
-      </w:pPr>
-      <w:bookmarkStart w:colFirst="0" w:colLast="0" w:name="_a9bw44gs6ztd" w:id="3"/>
-      <w:bookmarkEnd w:id="3"/>
-      <w:r>
-        <w:rPr>
-          <w:rtl w:val="0"/>
-        </w:rPr>
-      </w:r>
-    </w:p>
-    <w:p>
-      <w:pPr>
-        <w:rPr/>
-      </w:pPr>
-      <w:r>
-        <w:rPr>
-          <w:rtl w:val="0"/>
-        </w:rPr>
-      </w:r>
-    </w:p>
-    <w:p>
-      <w:pPr>
-        <w:rPr/>
-      </w:pPr>
-      <w:r>
-        <w:rPr>
-          <w:rtl w:val="0"/>
-        </w:rPr>
-      </w:r>
-    </w:p>
-    <w:p>
-      <w:pPr>
-        <w:rPr/>
-      </w:pPr>
-      <w:r>
-        <w:rPr>
-          <w:rtl w:val="0"/>
-        </w:rPr>
-      </w:r>
-    </w:p>
-    <w:p>
-      <w:pPr>
-        <w:rPr/>
-      </w:pPr>
-      <w:r>
-        <w:rPr>
-          <w:rtl w:val="0"/>
-        </w:rPr>
-      </w:r>
-    </w:p>
-    <w:p>
-      <w:pPr>
-        <w:rPr/>
-      </w:pPr>
-      <w:r>
-        <w:rPr>
-          <w:rtl w:val="0"/>
-        </w:rPr>
-      </w:r>
-    </w:p>
-    <w:p>
-      <w:pPr>
-        <w:rPr/>
-      </w:pPr>
-      <w:r>
-        <w:rPr>
-          <w:rtl w:val="0"/>
-        </w:rPr>
-      </w:r>
-    </w:p>
-    <w:p>
-      <w:pPr>
-        <w:rPr/>
+          <w:sz w:val="24"/>
+          <w:szCs w:val="24"/>
+        </w:rPr>
+      </w:pPr>
+      <w:r>
+        <w:rPr>
+          <w:rtl w:val="0"/>
+        </w:rPr>
+      </w:r>
+    </w:p>
+    <w:p>
+      <w:pPr>
+        <w:spacing w:line="360" w:lineRule="auto"/>
+        <w:rPr>
+          <w:sz w:val="24"/>
+          <w:szCs w:val="24"/>
+        </w:rPr>
+      </w:pPr>
+      <w:r>
+        <w:rPr>
+          <w:rtl w:val="0"/>
+        </w:rPr>
+      </w:r>
+    </w:p>
+    <w:p>
+      <w:pPr>
+        <w:spacing w:line="360" w:lineRule="auto"/>
+        <w:rPr>
+          <w:sz w:val="24"/>
+          <w:szCs w:val="24"/>
+        </w:rPr>
+      </w:pPr>
+      <w:r>
+        <w:rPr>
+          <w:rtl w:val="0"/>
+        </w:rPr>
+      </w:r>
+    </w:p>
+    <w:p>
+      <w:pPr>
+        <w:spacing w:line="360" w:lineRule="auto"/>
+        <w:rPr>
+          <w:sz w:val="24"/>
+          <w:szCs w:val="24"/>
+        </w:rPr>
+      </w:pPr>
+      <w:r>
+        <w:rPr>
+          <w:rtl w:val="0"/>
+        </w:rPr>
+      </w:r>
+    </w:p>
+    <w:p>
+      <w:pPr>
+        <w:spacing w:line="360" w:lineRule="auto"/>
+        <w:rPr>
+          <w:sz w:val="24"/>
+          <w:szCs w:val="24"/>
+        </w:rPr>
+      </w:pPr>
+      <w:r>
+        <w:rPr>
+          <w:rtl w:val="0"/>
+        </w:rPr>
+      </w:r>
+    </w:p>
+    <w:p>
+      <w:pPr>
+        <w:spacing w:line="360" w:lineRule="auto"/>
+        <w:rPr>
+          <w:sz w:val="24"/>
+          <w:szCs w:val="24"/>
+        </w:rPr>
+      </w:pPr>
+      <w:r>
+        <w:rPr>
+          <w:rtl w:val="0"/>
+        </w:rPr>
+      </w:r>
+    </w:p>
+    <w:p>
+      <w:pPr>
+        <w:spacing w:line="360" w:lineRule="auto"/>
+        <w:rPr>
+          <w:sz w:val="24"/>
+          <w:szCs w:val="24"/>
+        </w:rPr>
+      </w:pPr>
+      <w:r>
+        <w:rPr>
+          <w:rtl w:val="0"/>
+        </w:rPr>
+      </w:r>
+    </w:p>
+    <w:p>
+      <w:pPr>
+        <w:spacing w:line="360" w:lineRule="auto"/>
+        <w:rPr>
+          <w:sz w:val="24"/>
+          <w:szCs w:val="24"/>
+        </w:rPr>
+      </w:pPr>
+      <w:r>
+        <w:rPr>
+          <w:rtl w:val="0"/>
+        </w:rPr>
+      </w:r>
+    </w:p>
+    <w:p>
+      <w:pPr>
+        <w:spacing w:line="360" w:lineRule="auto"/>
+        <w:rPr>
+          <w:sz w:val="24"/>
+          <w:szCs w:val="24"/>
+        </w:rPr>
+      </w:pPr>
+      <w:r>
+        <w:rPr>
+          <w:rtl w:val="0"/>
+        </w:rPr>
+      </w:r>
+    </w:p>
+    <w:p>
+      <w:pPr>
+        <w:spacing w:line="360" w:lineRule="auto"/>
+        <w:rPr>
+          <w:sz w:val="24"/>
+          <w:szCs w:val="24"/>
+        </w:rPr>
+      </w:pPr>
+      <w:r>
+        <w:rPr>
+          <w:rtl w:val="0"/>
+        </w:rPr>
+      </w:r>
+    </w:p>
+    <w:p>
+      <w:pPr>
+        <w:spacing w:line="360" w:lineRule="auto"/>
+        <w:rPr>
+          <w:sz w:val="24"/>
+          <w:szCs w:val="24"/>
+        </w:rPr>
       </w:pPr>
       <w:r>
         <w:rPr>
@@ -1736,7 +1737,7 @@
           <w:ilvl w:val="0"/>
           <w:numId w:val="5"/>
         </w:numPr>
-        <w:spacing w:after="80" w:lineRule="auto"/>
+        <w:spacing w:after="80" w:line="360" w:lineRule="auto"/>
         <w:ind w:left="720" w:hanging="360"/>
         <w:rPr>
           <w:b w:val="1"/>
@@ -1744,8 +1745,8 @@
           <w:szCs w:val="24"/>
         </w:rPr>
       </w:pPr>
-      <w:bookmarkStart w:colFirst="0" w:colLast="0" w:name="_36d6ofware0r" w:id="4"/>
-      <w:bookmarkEnd w:id="4"/>
+      <w:bookmarkStart w:colFirst="0" w:colLast="0" w:name="_36d6ofware0r" w:id="3"/>
+      <w:bookmarkEnd w:id="3"/>
       <w:r>
         <w:rPr>
           <w:b w:val="1"/>
@@ -1758,7 +1759,7 @@
     </w:p>
     <w:p>
       <w:pPr>
-        <w:spacing w:after="240" w:before="240" w:lineRule="auto"/>
+        <w:spacing w:after="240" w:before="240" w:line="360" w:lineRule="auto"/>
         <w:rPr/>
       </w:pPr>
       <w:r>
@@ -1782,7 +1783,7 @@
         <w:pStyle w:val="Heading3"/>
         <w:keepNext w:val="0"/>
         <w:keepLines w:val="0"/>
-        <w:spacing w:before="280" w:lineRule="auto"/>
+        <w:spacing w:before="280" w:line="360" w:lineRule="auto"/>
         <w:ind w:left="720" w:hanging="360"/>
         <w:rPr>
           <w:b w:val="1"/>
@@ -1791,8 +1792,8 @@
           <w:szCs w:val="24"/>
         </w:rPr>
       </w:pPr>
-      <w:bookmarkStart w:colFirst="0" w:colLast="0" w:name="_ay9ryuwdvotd" w:id="5"/>
-      <w:bookmarkEnd w:id="5"/>
+      <w:bookmarkStart w:colFirst="0" w:colLast="0" w:name="_ay9ryuwdvotd" w:id="4"/>
+      <w:bookmarkEnd w:id="4"/>
       <w:r>
         <w:rPr>
           <w:b w:val="1"/>
@@ -1809,7 +1810,7 @@
         <w:pStyle w:val="Heading4"/>
         <w:keepNext w:val="0"/>
         <w:keepLines w:val="0"/>
-        <w:spacing w:after="40" w:before="240" w:lineRule="auto"/>
+        <w:spacing w:after="40" w:before="240" w:line="360" w:lineRule="auto"/>
         <w:ind w:left="720" w:hanging="360"/>
         <w:rPr>
           <w:b w:val="1"/>
@@ -1818,8 +1819,8 @@
           <w:szCs w:val="22"/>
         </w:rPr>
       </w:pPr>
-      <w:bookmarkStart w:colFirst="0" w:colLast="0" w:name="_ov8xdlwhbxw" w:id="6"/>
-      <w:bookmarkEnd w:id="6"/>
+      <w:bookmarkStart w:colFirst="0" w:colLast="0" w:name="_ov8xdlwhbxw" w:id="5"/>
+      <w:bookmarkEnd w:id="5"/>
       <w:r>
         <w:rPr>
           <w:b w:val="1"/>
@@ -1833,14 +1834,50 @@
     </w:p>
     <w:p>
       <w:pPr>
-        <w:spacing w:after="240" w:before="240" w:lineRule="auto"/>
-        <w:rPr/>
-      </w:pPr>
-      <w:r>
-        <w:rPr>
-          <w:rtl w:val="0"/>
-        </w:rPr>
-        <w:t xml:space="preserve">Durante el desarrollo del proyecto se enfrentaron diversas dificultades técnicas y organizacionales. En primer lugar, se presentaron desafíos en la conexión inicial entre el frontend y el backend en Supabase, especialmente al manejar la lógica dentro de Cloud Functions y los permisos mediante políticas RLS (Row Level Security), esto debido a que contabamos solo con algunas experiencias vagas que teniamos con este Baas, por ende recurrimimos a la documentacion oficial, para entender mejor ttdos sus servicios, otra dificultad a nivel personal, fue la primera </w:t>
+        <w:spacing w:after="240" w:before="240" w:line="360" w:lineRule="auto"/>
+        <w:rPr/>
+      </w:pPr>
+      <w:r>
+        <w:rPr>
+          <w:rtl w:val="0"/>
+        </w:rPr>
+        <w:t xml:space="preserve">Durante el desarrollo del proyecto se presentaron diversas dificultades técnicas y organizacionales. En primer lugar, surgieron desafíos en la conexión inicial entre el frontend y el backend en Supabase, especialmente al manejar la lógica dentro de las Edge Functions y los permisos mediante políticas RLS (Row Level Security). Esto se debió a que contába solo con una experiencia previa limitada en el uso de este BaaS, por lo que recurrimos a la documentación oficial para comprender mejor todos sus servicios.</w:t>
+      </w:r>
+    </w:p>
+    <w:p>
+      <w:pPr>
+        <w:spacing w:after="240" w:before="240" w:line="360" w:lineRule="auto"/>
+        <w:rPr/>
+      </w:pPr>
+      <w:r>
+        <w:rPr>
+          <w:rtl w:val="0"/>
+        </w:rPr>
+        <w:t xml:space="preserve">A nivel personal, fue la primera vez que trabajé con la integración de IA, consumiendo directamente una API, en este caso la de Gemini. Uno de los principales problemas que encontré fue la estructura del </w:t>
+      </w:r>
+      <w:r>
+        <w:rPr>
+          <w:i w:val="1"/>
+          <w:rtl w:val="0"/>
+        </w:rPr>
+        <w:t xml:space="preserve">prompt</w:t>
+      </w:r>
+      <w:r>
+        <w:rPr>
+          <w:rtl w:val="0"/>
+        </w:rPr>
+        <w:t xml:space="preserve">, ya que debía ser lo más precisa posible para evitar que el modelo “sobrepensara” o generara información errónea. Además, debí configurar todo a nivel de seguridad dentro de las Edge Functions y crear una función que fuera fácil de implementar, limitando su uso únicamente a la tarea asignada.</w:t>
+      </w:r>
+    </w:p>
+    <w:p>
+      <w:pPr>
+        <w:spacing w:line="360" w:lineRule="auto"/>
+        <w:rPr/>
+      </w:pPr>
+      <w:r>
+        <w:rPr>
+          <w:rtl w:val="0"/>
+        </w:rPr>
       </w:r>
     </w:p>
     <w:p>
@@ -1848,7 +1885,7 @@
         <w:pStyle w:val="Heading4"/>
         <w:keepNext w:val="0"/>
         <w:keepLines w:val="0"/>
-        <w:spacing w:after="40" w:before="240" w:lineRule="auto"/>
+        <w:spacing w:after="40" w:before="240" w:line="360" w:lineRule="auto"/>
         <w:ind w:left="720" w:hanging="360"/>
         <w:rPr>
           <w:b w:val="1"/>
@@ -1857,8 +1894,8 @@
           <w:szCs w:val="22"/>
         </w:rPr>
       </w:pPr>
-      <w:bookmarkStart w:colFirst="0" w:colLast="0" w:name="_z1el72tvqm2k" w:id="7"/>
-      <w:bookmarkEnd w:id="7"/>
+      <w:bookmarkStart w:colFirst="0" w:colLast="0" w:name="_z1el72tvqm2k" w:id="6"/>
+      <w:bookmarkEnd w:id="6"/>
       <w:r>
         <w:rPr>
           <w:b w:val="1"/>
@@ -1872,16 +1909,70 @@
     </w:p>
     <w:p>
       <w:pPr>
-        <w:spacing w:after="240" w:before="240" w:lineRule="auto"/>
-        <w:rPr/>
-      </w:pPr>
-      <w:r>
-        <w:rPr>
-          <w:rtl w:val="0"/>
-        </w:rPr>
-        <w:t xml:space="preserve">Entre los aspectos que facilitaron el avance destacan la documentación clara proporcionada por Supabase, la comunicación fluida entre los integrantes del equipo y el apoyo docente recibido en las instancias de retroalimentación.</w:t>
-        <w:br w:type="textWrapping"/>
-        <w:t xml:space="preserve">El uso de GitHub para la gestión del proyecto permitió mantener una trazabilidad clara del progreso y las versiones de código, mientras que las reuniones semanales sirvieron para coordinar avances y resolver bloqueos.</w:t>
+        <w:spacing w:line="360" w:lineRule="auto"/>
+        <w:rPr/>
+      </w:pPr>
+      <w:r>
+        <w:rPr>
+          <w:rtl w:val="0"/>
+        </w:rPr>
+        <w:t xml:space="preserve">Uno de los principales facilitadores con los que conté fue mi experiencia previa en desarrollo con la tecnología React. En este caso, ya había tenido algunos acercamientos con React Native y el desarrollo móvil, lo que me permitió resolver dudas de mis compañeros sobre problemas técnicos o de implementación en esta tecnología.</w:t>
+      </w:r>
+    </w:p>
+    <w:p>
+      <w:pPr>
+        <w:spacing w:line="360" w:lineRule="auto"/>
+        <w:rPr/>
+      </w:pPr>
+      <w:r>
+        <w:rPr>
+          <w:rtl w:val="0"/>
+        </w:rPr>
+      </w:r>
+    </w:p>
+    <w:p>
+      <w:pPr>
+        <w:spacing w:line="360" w:lineRule="auto"/>
+        <w:rPr/>
+      </w:pPr>
+      <w:r>
+        <w:rPr>
+          <w:rtl w:val="0"/>
+        </w:rPr>
+        <w:t xml:space="preserve">Además, gracias a mi experiencia tanto académica como laboral, tengo la habilidad de buscar, comprender y aplicar con facilidad la información proveniente de la documentación oficial, la cual en este proyecto fue bastante completa, especialmente la de Supabase, Gemini y Expo para React Native.</w:t>
+      </w:r>
+    </w:p>
+    <w:p>
+      <w:pPr>
+        <w:spacing w:line="360" w:lineRule="auto"/>
+        <w:rPr/>
+      </w:pPr>
+      <w:r>
+        <w:rPr>
+          <w:rtl w:val="0"/>
+        </w:rPr>
+      </w:r>
+    </w:p>
+    <w:p>
+      <w:pPr>
+        <w:spacing w:after="240" w:before="240" w:line="360" w:lineRule="auto"/>
+        <w:rPr/>
+      </w:pPr>
+      <w:r>
+        <w:rPr>
+          <w:rtl w:val="0"/>
+        </w:rPr>
+      </w:r>
+    </w:p>
+    <w:p>
+      <w:pPr>
+        <w:spacing w:after="240" w:before="240" w:line="360" w:lineRule="auto"/>
+        <w:rPr/>
+      </w:pPr>
+      <w:r>
+        <w:rPr>
+          <w:rtl w:val="0"/>
+        </w:rPr>
       </w:r>
     </w:p>
     <w:p>
@@ -1889,7 +1980,7 @@
         <w:pStyle w:val="Heading4"/>
         <w:keepNext w:val="0"/>
         <w:keepLines w:val="0"/>
-        <w:spacing w:after="40" w:before="240" w:lineRule="auto"/>
+        <w:spacing w:after="40" w:before="240" w:line="360" w:lineRule="auto"/>
         <w:ind w:left="720" w:hanging="360"/>
         <w:rPr>
           <w:b w:val="1"/>
@@ -1898,8 +1989,8 @@
           <w:szCs w:val="22"/>
         </w:rPr>
       </w:pPr>
-      <w:bookmarkStart w:colFirst="0" w:colLast="0" w:name="_tlaro3xgidfo" w:id="8"/>
-      <w:bookmarkEnd w:id="8"/>
+      <w:bookmarkStart w:colFirst="0" w:colLast="0" w:name="_tlaro3xgidfo" w:id="7"/>
+      <w:bookmarkEnd w:id="7"/>
       <w:r>
         <w:rPr>
           <w:b w:val="1"/>
@@ -1913,7 +2004,7 @@
     </w:p>
     <w:p>
       <w:pPr>
-        <w:spacing w:after="240" w:before="240" w:lineRule="auto"/>
+        <w:spacing w:after="240" w:before="240" w:line="360" w:lineRule="auto"/>
         <w:rPr/>
       </w:pPr>
       <w:r>
@@ -1930,7 +2021,7 @@
         <w:pStyle w:val="Heading4"/>
         <w:keepNext w:val="0"/>
         <w:keepLines w:val="0"/>
-        <w:spacing w:after="40" w:before="240" w:lineRule="auto"/>
+        <w:spacing w:after="40" w:before="240" w:line="360" w:lineRule="auto"/>
         <w:ind w:left="720" w:hanging="360"/>
         <w:rPr>
           <w:b w:val="1"/>
@@ -1939,46 +2030,50 @@
           <w:szCs w:val="22"/>
         </w:rPr>
       </w:pPr>
-      <w:bookmarkStart w:colFirst="0" w:colLast="0" w:name="_6qwmntz3cjik" w:id="9"/>
-      <w:bookmarkEnd w:id="9"/>
-      <w:r>
-        <w:rPr>
-          <w:rtl w:val="0"/>
-        </w:rPr>
-      </w:r>
-    </w:p>
-    <w:p>
-      <w:pPr>
-        <w:rPr/>
-      </w:pPr>
-      <w:r>
-        <w:rPr>
-          <w:rtl w:val="0"/>
-        </w:rPr>
-      </w:r>
-    </w:p>
-    <w:p>
-      <w:pPr>
-        <w:rPr/>
-      </w:pPr>
-      <w:r>
-        <w:rPr>
-          <w:rtl w:val="0"/>
-        </w:rPr>
-      </w:r>
-    </w:p>
-    <w:p>
-      <w:pPr>
-        <w:rPr/>
-      </w:pPr>
-      <w:r>
-        <w:rPr>
-          <w:rtl w:val="0"/>
-        </w:rPr>
-      </w:r>
-    </w:p>
-    <w:p>
-      <w:pPr>
+      <w:bookmarkStart w:colFirst="0" w:colLast="0" w:name="_6qwmntz3cjik" w:id="8"/>
+      <w:bookmarkEnd w:id="8"/>
+      <w:r>
+        <w:rPr>
+          <w:rtl w:val="0"/>
+        </w:rPr>
+      </w:r>
+    </w:p>
+    <w:p>
+      <w:pPr>
+        <w:spacing w:line="360" w:lineRule="auto"/>
+        <w:rPr/>
+      </w:pPr>
+      <w:r>
+        <w:rPr>
+          <w:rtl w:val="0"/>
+        </w:rPr>
+      </w:r>
+    </w:p>
+    <w:p>
+      <w:pPr>
+        <w:spacing w:line="360" w:lineRule="auto"/>
+        <w:rPr/>
+      </w:pPr>
+      <w:r>
+        <w:rPr>
+          <w:rtl w:val="0"/>
+        </w:rPr>
+      </w:r>
+    </w:p>
+    <w:p>
+      <w:pPr>
+        <w:spacing w:line="360" w:lineRule="auto"/>
+        <w:rPr/>
+      </w:pPr>
+      <w:r>
+        <w:rPr>
+          <w:rtl w:val="0"/>
+        </w:rPr>
+      </w:r>
+    </w:p>
+    <w:p>
+      <w:pPr>
+        <w:spacing w:line="360" w:lineRule="auto"/>
         <w:rPr/>
       </w:pPr>
       <w:r>
@@ -1992,7 +2087,7 @@
         <w:pStyle w:val="Heading4"/>
         <w:keepNext w:val="0"/>
         <w:keepLines w:val="0"/>
-        <w:spacing w:after="40" w:before="240" w:lineRule="auto"/>
+        <w:spacing w:after="40" w:before="240" w:line="360" w:lineRule="auto"/>
         <w:ind w:left="720" w:hanging="360"/>
         <w:rPr>
           <w:b w:val="1"/>
@@ -2001,8 +2096,8 @@
           <w:szCs w:val="22"/>
         </w:rPr>
       </w:pPr>
-      <w:bookmarkStart w:colFirst="0" w:colLast="0" w:name="_o8gxho8xwpb4" w:id="10"/>
-      <w:bookmarkEnd w:id="10"/>
+      <w:bookmarkStart w:colFirst="0" w:colLast="0" w:name="_o8gxho8xwpb4" w:id="9"/>
+      <w:bookmarkEnd w:id="9"/>
       <w:r>
         <w:rPr>
           <w:b w:val="1"/>
@@ -2016,7 +2111,7 @@
     </w:p>
     <w:p>
       <w:pPr>
-        <w:spacing w:after="240" w:before="240" w:lineRule="auto"/>
+        <w:spacing w:after="240" w:before="240" w:line="360" w:lineRule="auto"/>
         <w:rPr/>
       </w:pPr>
       <w:r>
@@ -2032,7 +2127,7 @@
           <w:ilvl w:val="0"/>
           <w:numId w:val="2"/>
         </w:numPr>
-        <w:spacing w:after="0" w:afterAutospacing="0" w:before="240" w:lineRule="auto"/>
+        <w:spacing w:after="0" w:afterAutospacing="0" w:before="240" w:line="360" w:lineRule="auto"/>
         <w:ind w:left="720" w:hanging="360"/>
         <w:rPr/>
       </w:pPr>
@@ -2050,7 +2145,7 @@
           <w:ilvl w:val="0"/>
           <w:numId w:val="2"/>
         </w:numPr>
-        <w:spacing w:after="0" w:afterAutospacing="0" w:before="0" w:beforeAutospacing="0" w:lineRule="auto"/>
+        <w:spacing w:after="0" w:afterAutospacing="0" w:before="0" w:beforeAutospacing="0" w:line="360" w:lineRule="auto"/>
         <w:ind w:left="720" w:hanging="360"/>
         <w:rPr/>
       </w:pPr>
@@ -2068,7 +2163,7 @@
           <w:ilvl w:val="0"/>
           <w:numId w:val="2"/>
         </w:numPr>
-        <w:spacing w:after="0" w:afterAutospacing="0" w:before="0" w:beforeAutospacing="0" w:lineRule="auto"/>
+        <w:spacing w:after="0" w:afterAutospacing="0" w:before="0" w:beforeAutospacing="0" w:line="360" w:lineRule="auto"/>
         <w:ind w:left="720" w:hanging="360"/>
         <w:rPr/>
       </w:pPr>
@@ -2086,7 +2181,7 @@
           <w:ilvl w:val="0"/>
           <w:numId w:val="2"/>
         </w:numPr>
-        <w:spacing w:after="240" w:before="0" w:beforeAutospacing="0" w:lineRule="auto"/>
+        <w:spacing w:after="240" w:before="0" w:beforeAutospacing="0" w:line="360" w:lineRule="auto"/>
         <w:ind w:left="720" w:hanging="360"/>
         <w:rPr/>
       </w:pPr>
@@ -2107,7 +2202,7 @@
         <w:pStyle w:val="Heading3"/>
         <w:keepNext w:val="0"/>
         <w:keepLines w:val="0"/>
-        <w:spacing w:before="280" w:lineRule="auto"/>
+        <w:spacing w:before="280" w:line="360" w:lineRule="auto"/>
         <w:ind w:left="720" w:hanging="360"/>
         <w:rPr>
           <w:b w:val="1"/>
@@ -2116,8 +2211,8 @@
           <w:szCs w:val="24"/>
         </w:rPr>
       </w:pPr>
-      <w:bookmarkStart w:colFirst="0" w:colLast="0" w:name="_ye8n622i17fi" w:id="11"/>
-      <w:bookmarkEnd w:id="11"/>
+      <w:bookmarkStart w:colFirst="0" w:colLast="0" w:name="_ye8n622i17fi" w:id="10"/>
+      <w:bookmarkEnd w:id="10"/>
       <w:r>
         <w:rPr>
           <w:b w:val="1"/>
@@ -2134,7 +2229,7 @@
         <w:pStyle w:val="Heading4"/>
         <w:keepNext w:val="0"/>
         <w:keepLines w:val="0"/>
-        <w:spacing w:after="40" w:before="240" w:lineRule="auto"/>
+        <w:spacing w:after="40" w:before="240" w:line="360" w:lineRule="auto"/>
         <w:ind w:left="720" w:hanging="360"/>
         <w:rPr>
           <w:b w:val="1"/>
@@ -2143,8 +2238,8 @@
           <w:szCs w:val="22"/>
         </w:rPr>
       </w:pPr>
-      <w:bookmarkStart w:colFirst="0" w:colLast="0" w:name="_8hzusig2h8bh" w:id="12"/>
-      <w:bookmarkEnd w:id="12"/>
+      <w:bookmarkStart w:colFirst="0" w:colLast="0" w:name="_8hzusig2h8bh" w:id="11"/>
+      <w:bookmarkEnd w:id="11"/>
       <w:r>
         <w:rPr>
           <w:b w:val="1"/>
@@ -2158,7 +2253,7 @@
     </w:p>
     <w:p>
       <w:pPr>
-        <w:spacing w:after="240" w:before="240" w:lineRule="auto"/>
+        <w:spacing w:after="240" w:before="240" w:line="360" w:lineRule="auto"/>
         <w:rPr/>
       </w:pPr>
       <w:r>
@@ -2173,7 +2268,7 @@
         <w:pStyle w:val="Heading4"/>
         <w:keepNext w:val="0"/>
         <w:keepLines w:val="0"/>
-        <w:spacing w:after="40" w:before="240" w:lineRule="auto"/>
+        <w:spacing w:after="40" w:before="240" w:line="360" w:lineRule="auto"/>
         <w:ind w:left="720" w:hanging="360"/>
         <w:rPr>
           <w:b w:val="1"/>
@@ -2182,8 +2277,8 @@
           <w:szCs w:val="22"/>
         </w:rPr>
       </w:pPr>
-      <w:bookmarkStart w:colFirst="0" w:colLast="0" w:name="_8qvoayf7llyj" w:id="13"/>
-      <w:bookmarkEnd w:id="13"/>
+      <w:bookmarkStart w:colFirst="0" w:colLast="0" w:name="_8qvoayf7llyj" w:id="12"/>
+      <w:bookmarkEnd w:id="12"/>
       <w:r>
         <w:rPr>
           <w:b w:val="1"/>
@@ -2201,7 +2296,7 @@
           <w:ilvl w:val="0"/>
           <w:numId w:val="4"/>
         </w:numPr>
-        <w:spacing w:after="0" w:afterAutospacing="0" w:before="240" w:lineRule="auto"/>
+        <w:spacing w:after="0" w:afterAutospacing="0" w:before="240" w:line="360" w:lineRule="auto"/>
         <w:ind w:left="720" w:hanging="360"/>
       </w:pPr>
       <w:r>
@@ -2225,7 +2320,7 @@
           <w:ilvl w:val="0"/>
           <w:numId w:val="4"/>
         </w:numPr>
-        <w:spacing w:after="0" w:afterAutospacing="0" w:before="0" w:beforeAutospacing="0" w:lineRule="auto"/>
+        <w:spacing w:after="0" w:afterAutospacing="0" w:before="0" w:beforeAutospacing="0" w:line="360" w:lineRule="auto"/>
         <w:ind w:left="720" w:hanging="360"/>
       </w:pPr>
       <w:r>
@@ -2250,7 +2345,7 @@
           <w:ilvl w:val="0"/>
           <w:numId w:val="4"/>
         </w:numPr>
-        <w:spacing w:after="0" w:afterAutospacing="0" w:before="0" w:beforeAutospacing="0" w:lineRule="auto"/>
+        <w:spacing w:after="0" w:afterAutospacing="0" w:before="0" w:beforeAutospacing="0" w:line="360" w:lineRule="auto"/>
         <w:ind w:left="720" w:hanging="360"/>
       </w:pPr>
       <w:r>
@@ -2274,7 +2369,7 @@
           <w:ilvl w:val="0"/>
           <w:numId w:val="4"/>
         </w:numPr>
-        <w:spacing w:after="240" w:before="0" w:beforeAutospacing="0" w:lineRule="auto"/>
+        <w:spacing w:after="240" w:before="0" w:beforeAutospacing="0" w:line="360" w:lineRule="auto"/>
         <w:ind w:left="720" w:hanging="360"/>
       </w:pPr>
       <w:r>
@@ -2297,7 +2392,7 @@
         <w:pStyle w:val="Heading4"/>
         <w:keepNext w:val="0"/>
         <w:keepLines w:val="0"/>
-        <w:spacing w:after="40" w:before="240" w:lineRule="auto"/>
+        <w:spacing w:after="40" w:before="240" w:line="360" w:lineRule="auto"/>
         <w:ind w:left="720" w:hanging="360"/>
         <w:rPr>
           <w:b w:val="1"/>
@@ -2306,8 +2401,8 @@
           <w:szCs w:val="22"/>
         </w:rPr>
       </w:pPr>
-      <w:bookmarkStart w:colFirst="0" w:colLast="0" w:name="_abzq03kxp1n1" w:id="14"/>
-      <w:bookmarkEnd w:id="14"/>
+      <w:bookmarkStart w:colFirst="0" w:colLast="0" w:name="_abzq03kxp1n1" w:id="13"/>
+      <w:bookmarkEnd w:id="13"/>
       <w:r>
         <w:rPr>
           <w:b w:val="1"/>
@@ -2321,7 +2416,7 @@
     </w:p>
     <w:p>
       <w:pPr>
-        <w:spacing w:after="240" w:before="240" w:lineRule="auto"/>
+        <w:spacing w:after="240" w:before="240" w:line="360" w:lineRule="auto"/>
         <w:rPr/>
       </w:pPr>
       <w:r>
@@ -2337,7 +2432,7 @@
           <w:ilvl w:val="0"/>
           <w:numId w:val="1"/>
         </w:numPr>
-        <w:spacing w:after="0" w:afterAutospacing="0" w:before="240" w:lineRule="auto"/>
+        <w:spacing w:after="0" w:afterAutospacing="0" w:before="240" w:line="360" w:lineRule="auto"/>
         <w:ind w:left="720" w:hanging="360"/>
       </w:pPr>
       <w:r>
@@ -2361,7 +2456,7 @@
           <w:ilvl w:val="0"/>
           <w:numId w:val="1"/>
         </w:numPr>
-        <w:spacing w:after="0" w:afterAutospacing="0" w:before="0" w:beforeAutospacing="0" w:lineRule="auto"/>
+        <w:spacing w:after="0" w:afterAutospacing="0" w:before="0" w:beforeAutospacing="0" w:line="360" w:lineRule="auto"/>
         <w:ind w:left="720" w:hanging="360"/>
       </w:pPr>
       <w:r>
@@ -2390,7 +2485,7 @@
           <w:ilvl w:val="0"/>
           <w:numId w:val="1"/>
         </w:numPr>
-        <w:spacing w:after="240" w:before="0" w:beforeAutospacing="0" w:lineRule="auto"/>
+        <w:spacing w:after="240" w:before="0" w:beforeAutospacing="0" w:line="360" w:lineRule="auto"/>
         <w:ind w:left="720" w:hanging="360"/>
       </w:pPr>
       <w:r>
@@ -2422,7 +2517,7 @@
     </w:p>
     <w:p>
       <w:pPr>
-        <w:spacing w:after="240" w:before="240" w:lineRule="auto"/>
+        <w:spacing w:after="240" w:before="240" w:line="360" w:lineRule="auto"/>
         <w:ind w:left="0" w:firstLine="0"/>
         <w:rPr/>
       </w:pPr>
@@ -2437,7 +2532,7 @@
         <w:pStyle w:val="Heading3"/>
         <w:keepNext w:val="0"/>
         <w:keepLines w:val="0"/>
-        <w:spacing w:before="280" w:lineRule="auto"/>
+        <w:spacing w:before="280" w:line="360" w:lineRule="auto"/>
         <w:rPr>
           <w:b w:val="1"/>
           <w:color w:val="000000"/>
@@ -2445,8 +2540,8 @@
           <w:szCs w:val="24"/>
         </w:rPr>
       </w:pPr>
-      <w:bookmarkStart w:colFirst="0" w:colLast="0" w:name="_9tib86b2us3" w:id="15"/>
-      <w:bookmarkEnd w:id="15"/>
+      <w:bookmarkStart w:colFirst="0" w:colLast="0" w:name="_9tib86b2us3" w:id="14"/>
+      <w:bookmarkEnd w:id="14"/>
       <w:r>
         <w:rPr>
           <w:b w:val="1"/>
@@ -2460,7 +2555,7 @@
     </w:p>
     <w:p>
       <w:pPr>
-        <w:spacing w:after="240" w:before="240" w:lineRule="auto"/>
+        <w:spacing w:after="240" w:before="240" w:line="360" w:lineRule="auto"/>
         <w:rPr/>
       </w:pPr>
       <w:r>
@@ -2472,7 +2567,7 @@
     </w:p>
     <w:p>
       <w:pPr>
-        <w:spacing w:after="240" w:before="240" w:lineRule="auto"/>
+        <w:spacing w:after="240" w:before="240" w:line="360" w:lineRule="auto"/>
         <w:rPr/>
       </w:pPr>
       <w:r>
@@ -2484,7 +2579,7 @@
     </w:p>
     <w:p>
       <w:pPr>
-        <w:spacing w:after="240" w:before="240" w:lineRule="auto"/>
+        <w:spacing w:after="240" w:before="240" w:line="360" w:lineRule="auto"/>
         <w:rPr/>
       </w:pPr>
       <w:r>
@@ -2498,7 +2593,7 @@
         <w:pStyle w:val="Heading3"/>
         <w:keepNext w:val="0"/>
         <w:keepLines w:val="0"/>
-        <w:spacing w:before="280" w:lineRule="auto"/>
+        <w:spacing w:before="280" w:line="360" w:lineRule="auto"/>
         <w:rPr>
           <w:b w:val="1"/>
           <w:color w:val="000000"/>
@@ -2506,8 +2601,8 @@
           <w:szCs w:val="24"/>
         </w:rPr>
       </w:pPr>
-      <w:bookmarkStart w:colFirst="0" w:colLast="0" w:name="_o699bo9n5qvg" w:id="16"/>
-      <w:bookmarkEnd w:id="16"/>
+      <w:bookmarkStart w:colFirst="0" w:colLast="0" w:name="_o699bo9n5qvg" w:id="15"/>
+      <w:bookmarkEnd w:id="15"/>
       <w:r>
         <w:rPr>
           <w:b w:val="1"/>
@@ -2524,7 +2619,7 @@
         <w:pStyle w:val="Heading4"/>
         <w:keepNext w:val="0"/>
         <w:keepLines w:val="0"/>
-        <w:spacing w:after="40" w:before="240" w:lineRule="auto"/>
+        <w:spacing w:after="40" w:before="240" w:line="360" w:lineRule="auto"/>
         <w:rPr>
           <w:b w:val="1"/>
           <w:color w:val="000000"/>
@@ -2532,8 +2627,8 @@
           <w:szCs w:val="22"/>
         </w:rPr>
       </w:pPr>
-      <w:bookmarkStart w:colFirst="0" w:colLast="0" w:name="_ltnys5hpqnsq" w:id="17"/>
-      <w:bookmarkEnd w:id="17"/>
+      <w:bookmarkStart w:colFirst="0" w:colLast="0" w:name="_ltnys5hpqnsq" w:id="16"/>
+      <w:bookmarkEnd w:id="16"/>
       <w:r>
         <w:rPr>
           <w:b w:val="1"/>
@@ -2547,7 +2642,7 @@
     </w:p>
     <w:p>
       <w:pPr>
-        <w:spacing w:after="240" w:before="240" w:lineRule="auto"/>
+        <w:spacing w:after="240" w:before="240" w:line="360" w:lineRule="auto"/>
         <w:rPr/>
       </w:pPr>
       <w:r>
@@ -2578,7 +2673,7 @@
           <w:ilvl w:val="0"/>
           <w:numId w:val="3"/>
         </w:numPr>
-        <w:spacing w:after="0" w:afterAutospacing="0" w:before="240" w:lineRule="auto"/>
+        <w:spacing w:after="0" w:afterAutospacing="0" w:before="240" w:line="360" w:lineRule="auto"/>
         <w:ind w:left="720" w:hanging="360"/>
       </w:pPr>
       <w:r>
@@ -2602,7 +2697,7 @@
           <w:ilvl w:val="0"/>
           <w:numId w:val="3"/>
         </w:numPr>
-        <w:spacing w:after="0" w:afterAutospacing="0" w:before="0" w:beforeAutospacing="0" w:lineRule="auto"/>
+        <w:spacing w:after="0" w:afterAutospacing="0" w:before="0" w:beforeAutospacing="0" w:line="360" w:lineRule="auto"/>
         <w:ind w:left="720" w:hanging="360"/>
       </w:pPr>
       <w:r>
@@ -2626,7 +2721,7 @@
           <w:ilvl w:val="0"/>
           <w:numId w:val="3"/>
         </w:numPr>
-        <w:spacing w:after="0" w:afterAutospacing="0" w:before="0" w:beforeAutospacing="0" w:lineRule="auto"/>
+        <w:spacing w:after="0" w:afterAutospacing="0" w:before="0" w:beforeAutospacing="0" w:line="360" w:lineRule="auto"/>
         <w:ind w:left="720" w:hanging="360"/>
       </w:pPr>
       <w:r>
@@ -2650,7 +2745,7 @@
           <w:ilvl w:val="0"/>
           <w:numId w:val="3"/>
         </w:numPr>
-        <w:spacing w:after="0" w:afterAutospacing="0" w:before="0" w:beforeAutospacing="0" w:lineRule="auto"/>
+        <w:spacing w:after="0" w:afterAutospacing="0" w:before="0" w:beforeAutospacing="0" w:line="360" w:lineRule="auto"/>
         <w:ind w:left="720" w:hanging="360"/>
       </w:pPr>
       <w:r>
@@ -2674,7 +2769,7 @@
           <w:ilvl w:val="0"/>
           <w:numId w:val="3"/>
         </w:numPr>
-        <w:spacing w:after="240" w:before="0" w:beforeAutospacing="0" w:lineRule="auto"/>
+        <w:spacing w:after="240" w:before="0" w:beforeAutospacing="0" w:line="360" w:lineRule="auto"/>
         <w:ind w:left="720" w:hanging="360"/>
       </w:pPr>
       <w:r>
@@ -2697,7 +2792,7 @@
         <w:pStyle w:val="Heading4"/>
         <w:keepNext w:val="0"/>
         <w:keepLines w:val="0"/>
-        <w:spacing w:after="40" w:before="240" w:lineRule="auto"/>
+        <w:spacing w:after="40" w:before="240" w:line="360" w:lineRule="auto"/>
         <w:rPr>
           <w:b w:val="1"/>
           <w:color w:val="000000"/>
@@ -2705,8 +2800,8 @@
           <w:szCs w:val="22"/>
         </w:rPr>
       </w:pPr>
-      <w:bookmarkStart w:colFirst="0" w:colLast="0" w:name="_rskttxo9w6es" w:id="18"/>
-      <w:bookmarkEnd w:id="18"/>
+      <w:bookmarkStart w:colFirst="0" w:colLast="0" w:name="_rskttxo9w6es" w:id="17"/>
+      <w:bookmarkEnd w:id="17"/>
       <w:r>
         <w:rPr>
           <w:b w:val="1"/>
@@ -2720,7 +2815,7 @@
     </w:p>
     <w:p>
       <w:pPr>
-        <w:spacing w:after="240" w:before="240" w:lineRule="auto"/>
+        <w:spacing w:after="240" w:before="240" w:line="360" w:lineRule="auto"/>
         <w:rPr/>
       </w:pPr>
       <w:r>
@@ -2736,8 +2831,9 @@
           <w:ilvl w:val="0"/>
           <w:numId w:val="6"/>
         </w:numPr>
-        <w:spacing w:after="0" w:afterAutospacing="0" w:before="240" w:lineRule="auto"/>
+        <w:spacing w:after="0" w:afterAutospacing="0" w:before="240" w:line="360" w:lineRule="auto"/>
         <w:ind w:left="720" w:hanging="360"/>
+        <w:rPr/>
       </w:pPr>
       <w:r>
         <w:rPr>
@@ -2753,8 +2849,9 @@
           <w:ilvl w:val="0"/>
           <w:numId w:val="6"/>
         </w:numPr>
-        <w:spacing w:after="0" w:afterAutospacing="0" w:before="0" w:beforeAutospacing="0" w:lineRule="auto"/>
+        <w:spacing w:after="0" w:afterAutospacing="0" w:before="0" w:beforeAutospacing="0" w:line="360" w:lineRule="auto"/>
         <w:ind w:left="720" w:hanging="360"/>
+        <w:rPr/>
       </w:pPr>
       <w:r>
         <w:rPr>
@@ -2770,8 +2867,9 @@
           <w:ilvl w:val="0"/>
           <w:numId w:val="6"/>
         </w:numPr>
-        <w:spacing w:after="240" w:before="0" w:beforeAutospacing="0" w:lineRule="auto"/>
+        <w:spacing w:after="240" w:before="0" w:beforeAutospacing="0" w:line="360" w:lineRule="auto"/>
         <w:ind w:left="720" w:hanging="360"/>
+        <w:rPr/>
       </w:pPr>
       <w:r>
         <w:rPr>
@@ -2786,7 +2884,7 @@
         <w:pStyle w:val="Heading4"/>
         <w:keepNext w:val="0"/>
         <w:keepLines w:val="0"/>
-        <w:spacing w:after="40" w:before="240" w:lineRule="auto"/>
+        <w:spacing w:after="40" w:before="240" w:line="360" w:lineRule="auto"/>
         <w:rPr>
           <w:b w:val="1"/>
           <w:color w:val="000000"/>
@@ -2794,8 +2892,8 @@
           <w:szCs w:val="22"/>
         </w:rPr>
       </w:pPr>
-      <w:bookmarkStart w:colFirst="0" w:colLast="0" w:name="_pjan361wkaat" w:id="19"/>
-      <w:bookmarkEnd w:id="19"/>
+      <w:bookmarkStart w:colFirst="0" w:colLast="0" w:name="_pjan361wkaat" w:id="18"/>
+      <w:bookmarkEnd w:id="18"/>
       <w:r>
         <w:rPr>
           <w:b w:val="1"/>
@@ -2809,7 +2907,7 @@
     </w:p>
     <w:p>
       <w:pPr>
-        <w:spacing w:after="240" w:before="240" w:lineRule="auto"/>
+        <w:spacing w:after="240" w:before="240" w:line="360" w:lineRule="auto"/>
         <w:rPr/>
       </w:pPr>
       <w:r>
@@ -2824,7 +2922,7 @@
         <w:pStyle w:val="Heading4"/>
         <w:keepNext w:val="0"/>
         <w:keepLines w:val="0"/>
-        <w:spacing w:after="40" w:before="240" w:lineRule="auto"/>
+        <w:spacing w:after="40" w:before="240" w:line="360" w:lineRule="auto"/>
         <w:rPr>
           <w:b w:val="1"/>
           <w:color w:val="000000"/>
@@ -2832,8 +2930,8 @@
           <w:szCs w:val="22"/>
         </w:rPr>
       </w:pPr>
-      <w:bookmarkStart w:colFirst="0" w:colLast="0" w:name="_indpq4po774w" w:id="20"/>
-      <w:bookmarkEnd w:id="20"/>
+      <w:bookmarkStart w:colFirst="0" w:colLast="0" w:name="_indpq4po774w" w:id="19"/>
+      <w:bookmarkEnd w:id="19"/>
       <w:r>
         <w:rPr>
           <w:b w:val="1"/>
@@ -2847,7 +2945,7 @@
     </w:p>
     <w:p>
       <w:pPr>
-        <w:spacing w:after="240" w:before="240" w:lineRule="auto"/>
+        <w:spacing w:after="240" w:before="240" w:line="360" w:lineRule="auto"/>
         <w:rPr/>
       </w:pPr>
       <w:r>
@@ -2868,7 +2966,7 @@
         <w:pStyle w:val="Heading4"/>
         <w:keepNext w:val="0"/>
         <w:keepLines w:val="0"/>
-        <w:spacing w:after="40" w:before="240" w:lineRule="auto"/>
+        <w:spacing w:after="40" w:before="240" w:line="360" w:lineRule="auto"/>
         <w:rPr>
           <w:b w:val="1"/>
           <w:color w:val="000000"/>
@@ -2876,8 +2974,8 @@
           <w:szCs w:val="22"/>
         </w:rPr>
       </w:pPr>
-      <w:bookmarkStart w:colFirst="0" w:colLast="0" w:name="_p83o53ntjc9m" w:id="21"/>
-      <w:bookmarkEnd w:id="21"/>
+      <w:bookmarkStart w:colFirst="0" w:colLast="0" w:name="_p83o53ntjc9m" w:id="20"/>
+      <w:bookmarkEnd w:id="20"/>
       <w:r>
         <w:rPr>
           <w:b w:val="1"/>
@@ -2891,7 +2989,7 @@
     </w:p>
     <w:p>
       <w:pPr>
-        <w:spacing w:after="240" w:before="240" w:lineRule="auto"/>
+        <w:spacing w:after="240" w:before="240" w:line="360" w:lineRule="auto"/>
         <w:rPr/>
       </w:pPr>
       <w:r>
@@ -2907,7 +3005,7 @@
           <w:ilvl w:val="0"/>
           <w:numId w:val="7"/>
         </w:numPr>
-        <w:spacing w:after="0" w:afterAutospacing="0" w:before="240" w:lineRule="auto"/>
+        <w:spacing w:after="0" w:afterAutospacing="0" w:before="240" w:line="360" w:lineRule="auto"/>
         <w:ind w:left="720" w:hanging="360"/>
       </w:pPr>
       <w:r>
@@ -2931,7 +3029,7 @@
           <w:ilvl w:val="0"/>
           <w:numId w:val="7"/>
         </w:numPr>
-        <w:spacing w:after="240" w:before="0" w:beforeAutospacing="0" w:lineRule="auto"/>
+        <w:spacing w:after="240" w:before="0" w:beforeAutospacing="0" w:line="360" w:lineRule="auto"/>
         <w:ind w:left="720" w:hanging="360"/>
       </w:pPr>
       <w:r>
@@ -2953,7 +3051,7 @@
         <w:pStyle w:val="Heading4"/>
         <w:keepNext w:val="0"/>
         <w:keepLines w:val="0"/>
-        <w:spacing w:after="40" w:before="240" w:lineRule="auto"/>
+        <w:spacing w:after="40" w:before="240" w:line="360" w:lineRule="auto"/>
         <w:rPr>
           <w:b w:val="1"/>
           <w:color w:val="000000"/>
@@ -2961,8 +3059,8 @@
           <w:szCs w:val="22"/>
         </w:rPr>
       </w:pPr>
-      <w:bookmarkStart w:colFirst="0" w:colLast="0" w:name="_g6nr5vac9dnk" w:id="22"/>
-      <w:bookmarkEnd w:id="22"/>
+      <w:bookmarkStart w:colFirst="0" w:colLast="0" w:name="_g6nr5vac9dnk" w:id="21"/>
+      <w:bookmarkEnd w:id="21"/>
       <w:r>
         <w:rPr>
           <w:b w:val="1"/>
@@ -2976,6 +3074,7 @@
     </w:p>
     <w:p>
       <w:pPr>
+        <w:spacing w:line="360" w:lineRule="auto"/>
         <w:rPr/>
       </w:pPr>
       <w:r>
@@ -2987,16 +3086,18 @@
     </w:p>
     <w:p>
       <w:pPr>
-        <w:rPr/>
-      </w:pPr>
-      <w:r>
-        <w:rPr>
-          <w:rtl w:val="0"/>
-        </w:rPr>
-      </w:r>
-    </w:p>
-    <w:p>
-      <w:pPr>
+        <w:spacing w:line="360" w:lineRule="auto"/>
+        <w:rPr/>
+      </w:pPr>
+      <w:r>
+        <w:rPr>
+          <w:rtl w:val="0"/>
+        </w:rPr>
+      </w:r>
+    </w:p>
+    <w:p>
+      <w:pPr>
+        <w:spacing w:line="360" w:lineRule="auto"/>
         <w:rPr/>
       </w:pPr>
       <w:r>
@@ -3008,16 +3109,18 @@
     </w:p>
     <w:p>
       <w:pPr>
-        <w:rPr/>
-      </w:pPr>
-      <w:r>
-        <w:rPr>
-          <w:rtl w:val="0"/>
-        </w:rPr>
-      </w:r>
-    </w:p>
-    <w:p>
-      <w:pPr>
+        <w:spacing w:line="360" w:lineRule="auto"/>
+        <w:rPr/>
+      </w:pPr>
+      <w:r>
+        <w:rPr>
+          <w:rtl w:val="0"/>
+        </w:rPr>
+      </w:r>
+    </w:p>
+    <w:p>
+      <w:pPr>
+        <w:spacing w:line="360" w:lineRule="auto"/>
         <w:rPr/>
       </w:pPr>
       <w:r>
@@ -3025,6 +3128,39 @@
           <w:rtl w:val="0"/>
         </w:rPr>
         <w:t xml:space="preserve">Se resguardó la calidad del proyecto aplicando metodologías y herramientas propias de la disciplina, como diseño centrado en el usuario, modelado relacional, y Scrum para la gestión del desarrollo, asegurando coherencia y cumplimiento de los objetivos del sistema.</w:t>
+      </w:r>
+    </w:p>
+    <w:p>
+      <w:pPr>
+        <w:spacing w:line="360" w:lineRule="auto"/>
+        <w:rPr/>
+      </w:pPr>
+      <w:r>
+        <w:rPr>
+          <w:rtl w:val="0"/>
+        </w:rPr>
+      </w:r>
+    </w:p>
+    <w:p>
+      <w:pPr>
+        <w:spacing w:line="360" w:lineRule="auto"/>
+        <w:rPr/>
+      </w:pPr>
+      <w:r>
+        <w:rPr>
+          <w:rtl w:val="0"/>
+        </w:rPr>
+      </w:r>
+    </w:p>
+    <w:p>
+      <w:pPr>
+        <w:spacing w:line="360" w:lineRule="auto"/>
+        <w:rPr/>
+      </w:pPr>
+      <w:r>
+        <w:rPr>
+          <w:rtl w:val="0"/>
+        </w:rPr>
       </w:r>
     </w:p>
     <w:p>
@@ -3032,7 +3168,7 @@
         <w:pStyle w:val="Heading3"/>
         <w:keepNext w:val="0"/>
         <w:keepLines w:val="0"/>
-        <w:spacing w:before="280" w:lineRule="auto"/>
+        <w:spacing w:before="280" w:line="360" w:lineRule="auto"/>
         <w:rPr>
           <w:b w:val="1"/>
           <w:color w:val="000000"/>
@@ -3040,8 +3176,8 @@
           <w:szCs w:val="24"/>
         </w:rPr>
       </w:pPr>
-      <w:bookmarkStart w:colFirst="0" w:colLast="0" w:name="_ld2yur9l2ueb" w:id="23"/>
-      <w:bookmarkEnd w:id="23"/>
+      <w:bookmarkStart w:colFirst="0" w:colLast="0" w:name="_ld2yur9l2ueb" w:id="22"/>
+      <w:bookmarkEnd w:id="22"/>
       <w:r>
         <w:rPr>
           <w:b w:val="1"/>
@@ -3055,7 +3191,7 @@
     </w:p>
     <w:p>
       <w:pPr>
-        <w:spacing w:after="240" w:before="240" w:lineRule="auto"/>
+        <w:spacing w:after="240" w:before="240" w:line="360" w:lineRule="auto"/>
         <w:rPr/>
       </w:pPr>
       <w:r>
@@ -3067,7 +3203,7 @@
     </w:p>
     <w:p>
       <w:pPr>
-        <w:spacing w:after="240" w:before="240" w:lineRule="auto"/>
+        <w:spacing w:after="240" w:before="240" w:line="360" w:lineRule="auto"/>
         <w:rPr/>
       </w:pPr>
       <w:r>
@@ -3079,7 +3215,7 @@
     </w:p>
     <w:p>
       <w:pPr>
-        <w:spacing w:after="240" w:before="240" w:lineRule="auto"/>
+        <w:spacing w:after="240" w:before="240" w:line="360" w:lineRule="auto"/>
         <w:rPr/>
       </w:pPr>
       <w:r>
@@ -3093,7 +3229,7 @@
         <w:pStyle w:val="Heading3"/>
         <w:keepNext w:val="0"/>
         <w:keepLines w:val="0"/>
-        <w:spacing w:before="280" w:lineRule="auto"/>
+        <w:spacing w:before="280" w:line="360" w:lineRule="auto"/>
         <w:rPr>
           <w:b w:val="1"/>
           <w:color w:val="000000"/>
@@ -3101,26 +3237,28 @@
           <w:szCs w:val="26"/>
         </w:rPr>
       </w:pPr>
-      <w:bookmarkStart w:colFirst="0" w:colLast="0" w:name="_t7omi5qcmgu9" w:id="24"/>
-      <w:bookmarkEnd w:id="24"/>
-      <w:r>
-        <w:rPr>
-          <w:rtl w:val="0"/>
-        </w:rPr>
-      </w:r>
-    </w:p>
-    <w:p>
-      <w:pPr>
-        <w:rPr/>
-      </w:pPr>
-      <w:r>
-        <w:rPr>
-          <w:rtl w:val="0"/>
-        </w:rPr>
-      </w:r>
-    </w:p>
-    <w:p>
-      <w:pPr>
+      <w:bookmarkStart w:colFirst="0" w:colLast="0" w:name="_t7omi5qcmgu9" w:id="23"/>
+      <w:bookmarkEnd w:id="23"/>
+      <w:r>
+        <w:rPr>
+          <w:rtl w:val="0"/>
+        </w:rPr>
+      </w:r>
+    </w:p>
+    <w:p>
+      <w:pPr>
+        <w:spacing w:line="360" w:lineRule="auto"/>
+        <w:rPr/>
+      </w:pPr>
+      <w:r>
+        <w:rPr>
+          <w:rtl w:val="0"/>
+        </w:rPr>
+      </w:r>
+    </w:p>
+    <w:p>
+      <w:pPr>
+        <w:spacing w:line="360" w:lineRule="auto"/>
         <w:rPr/>
       </w:pPr>
       <w:r>
@@ -3134,7 +3272,7 @@
         <w:pStyle w:val="Heading3"/>
         <w:keepNext w:val="0"/>
         <w:keepLines w:val="0"/>
-        <w:spacing w:before="280" w:lineRule="auto"/>
+        <w:spacing w:before="280" w:line="360" w:lineRule="auto"/>
         <w:rPr>
           <w:b w:val="1"/>
           <w:color w:val="000000"/>
@@ -3142,8 +3280,8 @@
           <w:szCs w:val="26"/>
         </w:rPr>
       </w:pPr>
-      <w:bookmarkStart w:colFirst="0" w:colLast="0" w:name="_dc222p2hdk0z" w:id="25"/>
-      <w:bookmarkEnd w:id="25"/>
+      <w:bookmarkStart w:colFirst="0" w:colLast="0" w:name="_dc222p2hdk0z" w:id="24"/>
+      <w:bookmarkEnd w:id="24"/>
       <w:r>
         <w:rPr>
           <w:rtl w:val="0"/>
@@ -3155,70 +3293,30 @@
         <w:pStyle w:val="Heading3"/>
         <w:keepNext w:val="0"/>
         <w:keepLines w:val="0"/>
-        <w:spacing w:before="280" w:lineRule="auto"/>
+        <w:spacing w:before="280" w:line="360" w:lineRule="auto"/>
+        <w:rPr/>
+      </w:pPr>
+      <w:bookmarkStart w:colFirst="0" w:colLast="0" w:name="_6e8zkcfd8p9k" w:id="25"/>
+      <w:bookmarkEnd w:id="25"/>
+      <w:r>
         <w:rPr>
           <w:b w:val="1"/>
           <w:color w:val="000000"/>
           <w:sz w:val="24"/>
           <w:szCs w:val="24"/>
-        </w:rPr>
-      </w:pPr>
-      <w:bookmarkStart w:colFirst="0" w:colLast="0" w:name="_6e8zkcfd8p9k" w:id="26"/>
-      <w:bookmarkEnd w:id="26"/>
-      <w:r>
-        <w:rPr>
-          <w:b w:val="1"/>
-          <w:color w:val="000000"/>
-          <w:sz w:val="24"/>
-          <w:szCs w:val="24"/>
           <w:rtl w:val="0"/>
         </w:rPr>
         <w:t xml:space="preserve">6. Reflexiones individuales</w:t>
       </w:r>
-    </w:p>
-    <w:p>
-      <w:pPr>
-        <w:spacing w:after="240" w:before="240" w:lineRule="auto"/>
-        <w:rPr/>
-      </w:pPr>
-      <w:r>
-        <w:rPr>
-          <w:b w:val="1"/>
-          <w:rtl w:val="0"/>
-        </w:rPr>
-        <w:t xml:space="preserve">Matías González:</w:t>
-        <w:br w:type="textWrapping"/>
-      </w:r>
-      <w:r>
-        <w:rPr>
-          <w:rtl w:val="0"/>
-        </w:rPr>
-        <w:t xml:space="preserve"> El desarrollo de este proyecto representó un desafío importante en términos técnicos y de gestión. Asumir el rol de coordinador me permitió fortalecer habilidades de liderazgo y organización, además de profundizar en el uso de tecnologías serverless como Supabase. La integración de funciones en la nube fue una experiencia enriquecedora que me permitió aplicar conceptos de arquitectura moderna. El experimentar con la API de Google Gemini me abrió un nuevo camino en el mundo de la IA Generativa, puesto que hasta ahora no había interactuado con LLMS de Google. Recomiendo Vertex AI.</w:t>
-      </w:r>
-    </w:p>
-    <w:p>
-      <w:pPr>
-        <w:spacing w:after="240" w:before="240" w:lineRule="auto"/>
-        <w:rPr/>
-      </w:pPr>
-      <w:r>
-        <w:rPr>
-          <w:b w:val="1"/>
-          <w:rtl w:val="0"/>
-        </w:rPr>
-        <w:t xml:space="preserve">Felipe Valdebenito:</w:t>
-        <w:br w:type="textWrapping"/>
-      </w:r>
-      <w:r>
-        <w:rPr>
-          <w:rtl w:val="0"/>
-        </w:rPr>
-        <w:t xml:space="preserve"> El desarrollo de este proyecto fue una experiencia muy enriquecedora tanto a nivel técnico como de colaboración. Asumir el rol de encargado del frontend y la documentación técnica me permitió fortalecer mis conocimientos en React y mejorar en el diseño de interfaces funcionales y usables. Además, la elaboración de la documentación me ayudó a estructurar y comunicar de manera clara los aspectos técnicos del sistema. Considero que la coordinación constante con mis compañeros fue clave para mantener un flujo de trabajo ordenado, resolver problemas de manera conjunta y cumplir con los objetivos propuestos dentro de los plazos establecidos.</w:t>
-      </w:r>
-    </w:p>
-    <w:p>
-      <w:pPr>
-        <w:spacing w:after="240" w:before="240" w:lineRule="auto"/>
+      <w:r>
+        <w:rPr>
+          <w:rtl w:val="0"/>
+        </w:rPr>
+      </w:r>
+    </w:p>
+    <w:p>
+      <w:pPr>
+        <w:spacing w:after="240" w:before="240" w:line="360" w:lineRule="auto"/>
         <w:rPr/>
       </w:pPr>
       <w:r>
@@ -3242,12 +3340,53 @@
       </w:r>
     </w:p>
     <w:sectPr>
+      <w:footerReference r:id="rId6" w:type="default"/>
+      <w:footerReference r:id="rId7" w:type="first"/>
       <w:pgSz w:h="16834" w:w="11909" w:orient="portrait"/>
       <w:pgMar w:bottom="1440" w:top="1440" w:left="1440" w:right="1440" w:header="720" w:footer="720"/>
       <w:pgNumType w:start="1"/>
+      <w:titlePg w:val="1"/>
     </w:sectPr>
   </w:body>
 </w:document>
+</file>
+
+<file path=word/footer1.xml><?xml version="1.0" encoding="utf-8"?>
+<w:ftr xmlns:mc="http://schemas.openxmlformats.org/markup-compatibility/2006" xmlns:o="urn:schemas-microsoft-com:office:office" xmlns:r="http://schemas.openxmlformats.org/officeDocument/2006/relationships" xmlns:m="http://schemas.openxmlformats.org/officeDocument/2006/math" xmlns:v="urn:schemas-microsoft-com:vml" xmlns:wp="http://schemas.openxmlformats.org/drawingml/2006/wordprocessingDrawing" xmlns:w10="urn:schemas-microsoft-com:office:word" xmlns:w="http://schemas.openxmlformats.org/wordprocessingml/2006/main" xmlns:wne="http://schemas.microsoft.com/office/word/2006/wordml" xmlns:sl="http://schemas.openxmlformats.org/schemaLibrary/2006/main" xmlns:a="http://schemas.openxmlformats.org/drawingml/2006/main" xmlns:pic="http://schemas.openxmlformats.org/drawingml/2006/picture" xmlns:c="http://schemas.openxmlformats.org/drawingml/2006/chart" xmlns:lc="http://schemas.openxmlformats.org/drawingml/2006/lockedCanvas" xmlns:dgm="http://schemas.openxmlformats.org/drawingml/2006/diagram" xmlns:wps="http://schemas.microsoft.com/office/word/2010/wordprocessingShape" xmlns:wpg="http://schemas.microsoft.com/office/word/2010/wordprocessingGroup" xmlns:w14="http://schemas.microsoft.com/office/word/2010/wordml" xmlns:w15="http://schemas.microsoft.com/office/word/2012/wordml" xmlns:w16="http://schemas.microsoft.com/office/word/2018/wordml" xmlns:w16cex="http://schemas.microsoft.com/office/word/2018/wordml/cex" xmlns:w16cid="http://schemas.microsoft.com/office/word/2016/wordml/cid" xmlns="http://schemas.microsoft.com/office/tasks/2019/documenttasks" xmlns:cr="http://schemas.microsoft.com/office/comments/2020/reactions">
+  <w:p>
+    <w:pPr>
+      <w:rPr/>
+    </w:pPr>
+    <w:r>
+      <w:rPr>
+        <w:rtl w:val="0"/>
+      </w:rPr>
+    </w:r>
+  </w:p>
+</w:ftr>
+</file>
+
+<file path=word/footer2.xml><?xml version="1.0" encoding="utf-8"?>
+<w:ftr xmlns:mc="http://schemas.openxmlformats.org/markup-compatibility/2006" xmlns:o="urn:schemas-microsoft-com:office:office" xmlns:r="http://schemas.openxmlformats.org/officeDocument/2006/relationships" xmlns:m="http://schemas.openxmlformats.org/officeDocument/2006/math" xmlns:v="urn:schemas-microsoft-com:vml" xmlns:wp="http://schemas.openxmlformats.org/drawingml/2006/wordprocessingDrawing" xmlns:w10="urn:schemas-microsoft-com:office:word" xmlns:w="http://schemas.openxmlformats.org/wordprocessingml/2006/main" xmlns:wne="http://schemas.microsoft.com/office/word/2006/wordml" xmlns:sl="http://schemas.openxmlformats.org/schemaLibrary/2006/main" xmlns:a="http://schemas.openxmlformats.org/drawingml/2006/main" xmlns:pic="http://schemas.openxmlformats.org/drawingml/2006/picture" xmlns:c="http://schemas.openxmlformats.org/drawingml/2006/chart" xmlns:lc="http://schemas.openxmlformats.org/drawingml/2006/lockedCanvas" xmlns:dgm="http://schemas.openxmlformats.org/drawingml/2006/diagram" xmlns:wps="http://schemas.microsoft.com/office/word/2010/wordprocessingShape" xmlns:wpg="http://schemas.microsoft.com/office/word/2010/wordprocessingGroup" xmlns:w14="http://schemas.microsoft.com/office/word/2010/wordml" xmlns:w15="http://schemas.microsoft.com/office/word/2012/wordml" xmlns:w16="http://schemas.microsoft.com/office/word/2018/wordml" xmlns:w16cex="http://schemas.microsoft.com/office/word/2018/wordml/cex" xmlns:w16cid="http://schemas.microsoft.com/office/word/2016/wordml/cid" xmlns="http://schemas.microsoft.com/office/tasks/2019/documenttasks" xmlns:cr="http://schemas.microsoft.com/office/comments/2020/reactions">
+  <w:p>
+    <w:pPr>
+      <w:jc w:val="right"/>
+      <w:rPr/>
+    </w:pPr>
+    <w:r>
+      <w:rPr/>
+      <w:fldChar w:fldCharType="begin"/>
+      <w:instrText xml:space="preserve">PAGE</w:instrText>
+      <w:fldChar w:fldCharType="separate"/>
+      <w:fldChar w:fldCharType="end"/>
+    </w:r>
+    <w:r>
+      <w:rPr>
+        <w:rtl w:val="0"/>
+      </w:rPr>
+    </w:r>
+  </w:p>
+</w:ftr>
 </file>
 
 <file path=word/numbering.xml><?xml version="1.0" encoding="utf-8"?>

</xml_diff>